<commit_message>
updated alingment for question 7
</commit_message>
<xml_diff>
--- a/Seal_Top_Sheet_template.docx
+++ b/Seal_Top_Sheet_template.docx
@@ -413,15 +413,7 @@
                 <w:w w:val="70"/>
                 <w:sz w:val="20"/>
               </w:rPr>
-              <w:t>Program Name</w:t>
-            </w:r>
-            <w:r>
-              <w:rPr>
-                <w:b/>
-                <w:w w:val="70"/>
-                <w:sz w:val="20"/>
-              </w:rPr>
-              <w:t>:</w:t>
+              <w:t>Program Name:</w:t>
             </w:r>
             <w:r>
               <w:rPr>
@@ -5715,6 +5707,7 @@
           <w:p>
             <w:pPr>
               <w:pStyle w:val="TableParagraph"/>
+              <w:jc w:val="center"/>
               <w:rPr>
                 <w:rFonts w:ascii="Times New Roman"/>
                 <w:sz w:val="18"/>
@@ -5729,6 +5722,7 @@
           <w:p>
             <w:pPr>
               <w:pStyle w:val="TableParagraph"/>
+              <w:jc w:val="center"/>
               <w:rPr>
                 <w:rFonts w:ascii="Times New Roman"/>
                 <w:sz w:val="18"/>
@@ -5743,6 +5737,7 @@
           <w:p>
             <w:pPr>
               <w:pStyle w:val="TableParagraph"/>
+              <w:jc w:val="center"/>
               <w:rPr>
                 <w:rFonts w:ascii="Times New Roman"/>
                 <w:sz w:val="18"/>
@@ -5757,6 +5752,7 @@
           <w:p>
             <w:pPr>
               <w:pStyle w:val="TableParagraph"/>
+              <w:jc w:val="center"/>
               <w:rPr>
                 <w:rFonts w:ascii="Times New Roman"/>
                 <w:sz w:val="18"/>
@@ -5774,6 +5770,7 @@
           <w:p>
             <w:pPr>
               <w:pStyle w:val="TableParagraph"/>
+              <w:jc w:val="center"/>
               <w:rPr>
                 <w:rFonts w:ascii="Times New Roman"/>
                 <w:sz w:val="18"/>
@@ -5791,6 +5788,7 @@
           <w:p>
             <w:pPr>
               <w:pStyle w:val="TableParagraph"/>
+              <w:jc w:val="center"/>
               <w:rPr>
                 <w:rFonts w:ascii="Times New Roman"/>
                 <w:sz w:val="18"/>

</xml_diff>